<commit_message>
feat: expand Frappe ECC to 28 autonomous agents with orchestrator, product manager, self-healing debugger, RBAC, synthetic data, integrations, print formats, and DevOps
</commit_message>
<xml_diff>
--- a/docs/FRAPPE_ECC_AGENT_ARCHITECTURE_AND_PIPELINE.docx
+++ b/docs/FRAPPE_ECC_AGENT_ARCHITECTURE_AND_PIPELINE.docx
@@ -590,6 +590,254 @@
                 <w:color w:val="1F4E79"/>
                 <w:sz w:val="16"/>
               </w:rPr>
+              <w:t>frappe-autonomous-orchestrator</w:t>
+            </w:r>
+          </w:p>
+        </w:tc>
+        <w:tc>
+          <w:tcPr>
+            <w:tcW w:type="dxa" w:w="1930"/>
+            <w:shd w:fill="FFFFFF"/>
+            <w:tcMar>
+              <w:top w:w="35" w:type="dxa"/>
+              <w:bottom w:w="35" w:type="dxa"/>
+              <w:left w:w="50" w:type="dxa"/>
+              <w:right w:w="50" w:type="dxa"/>
+            </w:tcMar>
+          </w:tcPr>
+          <w:p>
+            <w:pPr>
+              <w:spacing w:after="0"/>
+            </w:pPr>
+            <w:r>
+              <w:rPr>
+                <w:rFonts w:ascii="Calibri" w:hAnsi="Calibri"/>
+                <w:sz w:val="16"/>
+              </w:rPr>
+              <w:t>Raw prompt from user</w:t>
+            </w:r>
+          </w:p>
+        </w:tc>
+        <w:tc>
+          <w:tcPr>
+            <w:tcW w:type="dxa" w:w="1930"/>
+            <w:shd w:fill="FFFFFF"/>
+            <w:tcMar>
+              <w:top w:w="35" w:type="dxa"/>
+              <w:bottom w:w="35" w:type="dxa"/>
+              <w:left w:w="50" w:type="dxa"/>
+              <w:right w:w="50" w:type="dxa"/>
+            </w:tcMar>
+          </w:tcPr>
+          <w:p>
+            <w:pPr>
+              <w:spacing w:after="0"/>
+            </w:pPr>
+            <w:r>
+              <w:rPr>
+                <w:rFonts w:ascii="Calibri" w:hAnsi="Calibri"/>
+                <w:sz w:val="16"/>
+              </w:rPr>
+              <w:t>Intent decomposition, dynamic DAG formation, multi-agent dispatch</w:t>
+            </w:r>
+          </w:p>
+        </w:tc>
+        <w:tc>
+          <w:tcPr>
+            <w:tcW w:type="dxa" w:w="1930"/>
+            <w:shd w:fill="FFFFFF"/>
+            <w:tcMar>
+              <w:top w:w="35" w:type="dxa"/>
+              <w:bottom w:w="35" w:type="dxa"/>
+              <w:left w:w="50" w:type="dxa"/>
+              <w:right w:w="50" w:type="dxa"/>
+            </w:tcMar>
+          </w:tcPr>
+          <w:p>
+            <w:pPr>
+              <w:spacing w:after="0"/>
+            </w:pPr>
+            <w:r>
+              <w:rPr>
+                <w:rFonts w:ascii="Calibri" w:hAnsi="Calibri"/>
+                <w:sz w:val="16"/>
+              </w:rPr>
+              <w:t>End-to-end execution pipeline</w:t>
+            </w:r>
+          </w:p>
+        </w:tc>
+        <w:tc>
+          <w:tcPr>
+            <w:tcW w:type="dxa" w:w="1930"/>
+            <w:shd w:fill="FFFFFF"/>
+            <w:tcMar>
+              <w:top w:w="35" w:type="dxa"/>
+              <w:bottom w:w="35" w:type="dxa"/>
+              <w:left w:w="50" w:type="dxa"/>
+              <w:right w:w="50" w:type="dxa"/>
+            </w:tcMar>
+          </w:tcPr>
+          <w:p>
+            <w:pPr>
+              <w:spacing w:after="0"/>
+            </w:pPr>
+            <w:r>
+              <w:rPr>
+                <w:rFonts w:ascii="Calibri" w:hAnsi="Calibri"/>
+                <w:sz w:val="16"/>
+              </w:rPr>
+              <w:t>All 27 downstream agents</w:t>
+            </w:r>
+          </w:p>
+        </w:tc>
+      </w:tr>
+      <w:tr>
+        <w:tc>
+          <w:tcPr>
+            <w:tcW w:type="dxa" w:w="1930"/>
+            <w:shd w:fill="F8FAFC"/>
+            <w:tcMar>
+              <w:top w:w="35" w:type="dxa"/>
+              <w:bottom w:w="35" w:type="dxa"/>
+              <w:left w:w="50" w:type="dxa"/>
+              <w:right w:w="50" w:type="dxa"/>
+            </w:tcMar>
+          </w:tcPr>
+          <w:p>
+            <w:pPr>
+              <w:spacing w:after="0"/>
+            </w:pPr>
+            <w:r>
+              <w:rPr>
+                <w:rFonts w:ascii="Calibri" w:hAnsi="Calibri"/>
+                <w:b/>
+                <w:color w:val="1F4E79"/>
+                <w:sz w:val="16"/>
+              </w:rPr>
+              <w:t>frappe-product-manager</w:t>
+            </w:r>
+          </w:p>
+        </w:tc>
+        <w:tc>
+          <w:tcPr>
+            <w:tcW w:type="dxa" w:w="1930"/>
+            <w:shd w:fill="F8FAFC"/>
+            <w:tcMar>
+              <w:top w:w="35" w:type="dxa"/>
+              <w:bottom w:w="35" w:type="dxa"/>
+              <w:left w:w="50" w:type="dxa"/>
+              <w:right w:w="50" w:type="dxa"/>
+            </w:tcMar>
+          </w:tcPr>
+          <w:p>
+            <w:pPr>
+              <w:spacing w:after="0"/>
+            </w:pPr>
+            <w:r>
+              <w:rPr>
+                <w:rFonts w:ascii="Calibri" w:hAnsi="Calibri"/>
+                <w:sz w:val="16"/>
+              </w:rPr>
+              <w:t>Raw prompt / business concept</w:t>
+            </w:r>
+          </w:p>
+        </w:tc>
+        <w:tc>
+          <w:tcPr>
+            <w:tcW w:type="dxa" w:w="1930"/>
+            <w:shd w:fill="F8FAFC"/>
+            <w:tcMar>
+              <w:top w:w="35" w:type="dxa"/>
+              <w:bottom w:w="35" w:type="dxa"/>
+              <w:left w:w="50" w:type="dxa"/>
+              <w:right w:w="50" w:type="dxa"/>
+            </w:tcMar>
+          </w:tcPr>
+          <w:p>
+            <w:pPr>
+              <w:spacing w:after="0"/>
+            </w:pPr>
+            <w:r>
+              <w:rPr>
+                <w:rFonts w:ascii="Calibri" w:hAnsi="Calibri"/>
+                <w:sz w:val="16"/>
+              </w:rPr>
+              <w:t>Domain discovery, user personas, PRD specs, acceptance criteria</w:t>
+            </w:r>
+          </w:p>
+        </w:tc>
+        <w:tc>
+          <w:tcPr>
+            <w:tcW w:type="dxa" w:w="1930"/>
+            <w:shd w:fill="F8FAFC"/>
+            <w:tcMar>
+              <w:top w:w="35" w:type="dxa"/>
+              <w:bottom w:w="35" w:type="dxa"/>
+              <w:left w:w="50" w:type="dxa"/>
+              <w:right w:w="50" w:type="dxa"/>
+            </w:tcMar>
+          </w:tcPr>
+          <w:p>
+            <w:pPr>
+              <w:spacing w:after="0"/>
+            </w:pPr>
+            <w:r>
+              <w:rPr>
+                <w:rFonts w:ascii="Calibri" w:hAnsi="Calibri"/>
+                <w:sz w:val="16"/>
+              </w:rPr>
+              <w:t>PRD_&lt;feature&gt;.md</w:t>
+            </w:r>
+          </w:p>
+        </w:tc>
+        <w:tc>
+          <w:tcPr>
+            <w:tcW w:type="dxa" w:w="1930"/>
+            <w:shd w:fill="F8FAFC"/>
+            <w:tcMar>
+              <w:top w:w="35" w:type="dxa"/>
+              <w:bottom w:w="35" w:type="dxa"/>
+              <w:left w:w="50" w:type="dxa"/>
+              <w:right w:w="50" w:type="dxa"/>
+            </w:tcMar>
+          </w:tcPr>
+          <w:p>
+            <w:pPr>
+              <w:spacing w:after="0"/>
+            </w:pPr>
+            <w:r>
+              <w:rPr>
+                <w:rFonts w:ascii="Calibri" w:hAnsi="Calibri"/>
+                <w:sz w:val="16"/>
+              </w:rPr>
+              <w:t>frappe-hld-architect, frappe-lld-designer</w:t>
+            </w:r>
+          </w:p>
+        </w:tc>
+      </w:tr>
+      <w:tr>
+        <w:tc>
+          <w:tcPr>
+            <w:tcW w:type="dxa" w:w="1930"/>
+            <w:shd w:fill="FFFFFF"/>
+            <w:tcMar>
+              <w:top w:w="35" w:type="dxa"/>
+              <w:bottom w:w="35" w:type="dxa"/>
+              <w:left w:w="50" w:type="dxa"/>
+              <w:right w:w="50" w:type="dxa"/>
+            </w:tcMar>
+          </w:tcPr>
+          <w:p>
+            <w:pPr>
+              <w:spacing w:after="0"/>
+            </w:pPr>
+            <w:r>
+              <w:rPr>
+                <w:rFonts w:ascii="Calibri" w:hAnsi="Calibri"/>
+                <w:b/>
+                <w:color w:val="1F4E79"/>
+                <w:sz w:val="16"/>
+              </w:rPr>
               <w:t>frappe-hld-architect</w:t>
             </w:r>
           </w:p>
@@ -838,7 +1086,7 @@
                 <w:color w:val="1F4E79"/>
                 <w:sz w:val="16"/>
               </w:rPr>
-              <w:t>frappe-planner</w:t>
+              <w:t>frappe-data-synthesizer</w:t>
             </w:r>
           </w:p>
         </w:tc>
@@ -862,7 +1110,7 @@
                 <w:rFonts w:ascii="Calibri" w:hAnsi="Calibri"/>
                 <w:sz w:val="16"/>
               </w:rPr>
-              <w:t>HLD.md + LLD.md</w:t>
+              <w:t>LLD schemas &amp; domain context</w:t>
             </w:r>
           </w:p>
         </w:tc>
@@ -886,7 +1134,7 @@
                 <w:rFonts w:ascii="Calibri" w:hAnsi="Calibri"/>
                 <w:sz w:val="16"/>
               </w:rPr>
-              <w:t>Taxonomy mapping, autonaming rules, DocType scaffolding</w:t>
+              <w:t>Relational seed fixture generation, mock transactions, edge cases</w:t>
             </w:r>
           </w:p>
         </w:tc>
@@ -910,7 +1158,7 @@
                 <w:rFonts w:ascii="Calibri" w:hAnsi="Calibri"/>
                 <w:sz w:val="16"/>
               </w:rPr>
-              <w:t>DocType JSON blueprints</w:t>
+              <w:t>fixtures/*.json, test_data.json</w:t>
             </w:r>
           </w:p>
         </w:tc>
@@ -934,7 +1182,7 @@
                 <w:rFonts w:ascii="Calibri" w:hAnsi="Calibri"/>
                 <w:sz w:val="16"/>
               </w:rPr>
-              <w:t>frappe-fullstack-developer, frappe-tdd-guide</w:t>
+              <w:t>frappe-manual-qa, frappe-automated-tester</w:t>
             </w:r>
           </w:p>
         </w:tc>
@@ -962,7 +1210,7 @@
                 <w:color w:val="1F4E79"/>
                 <w:sz w:val="16"/>
               </w:rPr>
-              <w:t>frappe-ui-ux-designer</w:t>
+              <w:t>frappe-rbac-compliance-guardian</w:t>
             </w:r>
           </w:p>
         </w:tc>
@@ -986,7 +1234,7 @@
                 <w:rFonts w:ascii="Calibri" w:hAnsi="Calibri"/>
                 <w:sz w:val="16"/>
               </w:rPr>
-              <w:t>LLD.md state machine &amp; fields</w:t>
+              <w:t>User roles &amp; access rules</w:t>
             </w:r>
           </w:p>
         </w:tc>
@@ -1010,7 +1258,7 @@
                 <w:rFonts w:ascii="Calibri" w:hAnsi="Calibri"/>
                 <w:sz w:val="16"/>
               </w:rPr>
-              <w:t>Desk layout ergonomics, visual tokens, responsive form specs</w:t>
+              <w:t>Custom DocPerms, row-level permission query filters, field permlevels</w:t>
             </w:r>
           </w:p>
         </w:tc>
@@ -1034,7 +1282,7 @@
                 <w:rFonts w:ascii="Calibri" w:hAnsi="Calibri"/>
                 <w:sz w:val="16"/>
               </w:rPr>
-              <w:t>UI/UX design guidelines</w:t>
+              <w:t>DocPerm JSONs, permission hooks</w:t>
             </w:r>
           </w:p>
         </w:tc>
@@ -1058,7 +1306,7 @@
                 <w:rFonts w:ascii="Calibri" w:hAnsi="Calibri"/>
                 <w:sz w:val="16"/>
               </w:rPr>
-              <w:t>frappe-wireframe-builder</w:t>
+              <w:t>frappe-backend-builder, frappe-security-reviewer</w:t>
             </w:r>
           </w:p>
         </w:tc>
@@ -1086,7 +1334,7 @@
                 <w:color w:val="1F4E79"/>
                 <w:sz w:val="16"/>
               </w:rPr>
-              <w:t>frappe-wireframe-builder</w:t>
+              <w:t>frappe-ui-ux-designer</w:t>
             </w:r>
           </w:p>
         </w:tc>
@@ -1110,7 +1358,7 @@
                 <w:rFonts w:ascii="Calibri" w:hAnsi="Calibri"/>
                 <w:sz w:val="16"/>
               </w:rPr>
-              <w:t>UI/UX guidelines + field schemas</w:t>
+              <w:t>LLD.md state machine &amp; fields</w:t>
             </w:r>
           </w:p>
         </w:tc>
@@ -1134,7 +1382,7 @@
                 <w:rFonts w:ascii="Calibri" w:hAnsi="Calibri"/>
                 <w:sz w:val="16"/>
               </w:rPr>
-              <w:t>Layout wireframing, child table grid design, modal dialog mockups</w:t>
+              <w:t>Desk layout ergonomics, visual tokens, responsive form specs</w:t>
             </w:r>
           </w:p>
         </w:tc>
@@ -1158,7 +1406,7 @@
                 <w:rFonts w:ascii="Calibri" w:hAnsi="Calibri"/>
                 <w:sz w:val="16"/>
               </w:rPr>
-              <w:t>wireframes.md</w:t>
+              <w:t>UI/UX design guidelines</w:t>
             </w:r>
           </w:p>
         </w:tc>
@@ -1182,7 +1430,7 @@
                 <w:rFonts w:ascii="Calibri" w:hAnsi="Calibri"/>
                 <w:sz w:val="16"/>
               </w:rPr>
-              <w:t>frappe-interactive-prototyper</w:t>
+              <w:t>frappe-wireframe-builder</w:t>
             </w:r>
           </w:p>
         </w:tc>
@@ -1210,7 +1458,7 @@
                 <w:color w:val="1F4E79"/>
                 <w:sz w:val="16"/>
               </w:rPr>
-              <w:t>frappe-interactive-prototyper</w:t>
+              <w:t>frappe-wireframe-builder</w:t>
             </w:r>
           </w:p>
         </w:tc>
@@ -1234,7 +1482,7 @@
                 <w:rFonts w:ascii="Calibri" w:hAnsi="Calibri"/>
                 <w:sz w:val="16"/>
               </w:rPr>
-              <w:t>wireframes.md + sample fixtures</w:t>
+              <w:t>UI/UX guidelines + field schemas</w:t>
             </w:r>
           </w:p>
         </w:tc>
@@ -1258,7 +1506,7 @@
                 <w:rFonts w:ascii="Calibri" w:hAnsi="Calibri"/>
                 <w:sz w:val="16"/>
               </w:rPr>
-              <w:t>Single-file Vue 3/Tailwind interactive prototype synthesis</w:t>
+              <w:t>Layout wireframing, child table grid design, modal dialog mockups</w:t>
             </w:r>
           </w:p>
         </w:tc>
@@ -1282,7 +1530,7 @@
                 <w:rFonts w:ascii="Calibri" w:hAnsi="Calibri"/>
                 <w:sz w:val="16"/>
               </w:rPr>
-              <w:t>interactive_prototype.html</w:t>
+              <w:t>wireframes.md</w:t>
             </w:r>
           </w:p>
         </w:tc>
@@ -1306,7 +1554,7 @@
                 <w:rFonts w:ascii="Calibri" w:hAnsi="Calibri"/>
                 <w:sz w:val="16"/>
               </w:rPr>
-              <w:t>Stakeholder Sign-Off, frappe-desk-builder</w:t>
+              <w:t>frappe-interactive-prototyper</w:t>
             </w:r>
           </w:p>
         </w:tc>
@@ -1334,7 +1582,7 @@
                 <w:color w:val="1F4E79"/>
                 <w:sz w:val="16"/>
               </w:rPr>
-              <w:t>frappe-tdd-guide</w:t>
+              <w:t>frappe-interactive-prototyper</w:t>
             </w:r>
           </w:p>
         </w:tc>
@@ -1358,7 +1606,7 @@
                 <w:rFonts w:ascii="Calibri" w:hAnsi="Calibri"/>
                 <w:sz w:val="16"/>
               </w:rPr>
-              <w:t>LLD.md validation rules</w:t>
+              <w:t>wireframes.md + sample fixtures</w:t>
             </w:r>
           </w:p>
         </w:tc>
@@ -1382,7 +1630,7 @@
                 <w:rFonts w:ascii="Calibri" w:hAnsi="Calibri"/>
                 <w:sz w:val="16"/>
               </w:rPr>
-              <w:t>Red-Green-Refactor test scaffolding; exception assertions</w:t>
+              <w:t>Single-file Vue 3/Tailwind interactive prototype synthesis</w:t>
             </w:r>
           </w:p>
         </w:tc>
@@ -1406,7 +1654,7 @@
                 <w:rFonts w:ascii="Calibri" w:hAnsi="Calibri"/>
                 <w:sz w:val="16"/>
               </w:rPr>
-              <w:t>test_&lt;doctype&gt;.py</w:t>
+              <w:t>interactive_prototype.html</w:t>
             </w:r>
           </w:p>
         </w:tc>
@@ -1430,7 +1678,7 @@
                 <w:rFonts w:ascii="Calibri" w:hAnsi="Calibri"/>
                 <w:sz w:val="16"/>
               </w:rPr>
-              <w:t>frappe-fullstack-developer</w:t>
+              <w:t>Stakeholder Sign-Off, frappe-desk-builder</w:t>
             </w:r>
           </w:p>
         </w:tc>
@@ -1458,7 +1706,7 @@
                 <w:color w:val="1F4E79"/>
                 <w:sz w:val="16"/>
               </w:rPr>
-              <w:t>frappe-manual-qa</w:t>
+              <w:t>frappe-tdd-guide</w:t>
             </w:r>
           </w:p>
         </w:tc>
@@ -1482,7 +1730,7 @@
                 <w:rFonts w:ascii="Calibri" w:hAnsi="Calibri"/>
                 <w:sz w:val="16"/>
               </w:rPr>
-              <w:t>Prototype &amp; Controller rules</w:t>
+              <w:t>LLD.md validation rules</w:t>
             </w:r>
           </w:p>
         </w:tc>
@@ -1506,7 +1754,7 @@
                 <w:rFonts w:ascii="Calibri" w:hAnsi="Calibri"/>
                 <w:sz w:val="16"/>
               </w:rPr>
-              <w:t>Boundary condition analysis, exploratory charters, QA matrices</w:t>
+              <w:t>Red-Green-Refactor test scaffolding; exception assertions</w:t>
             </w:r>
           </w:p>
         </w:tc>
@@ -1530,7 +1778,7 @@
                 <w:rFonts w:ascii="Calibri" w:hAnsi="Calibri"/>
                 <w:sz w:val="16"/>
               </w:rPr>
-              <w:t>test_scenarios.md &amp; test_data.json</w:t>
+              <w:t>test_&lt;doctype&gt;.py</w:t>
             </w:r>
           </w:p>
         </w:tc>
@@ -1554,7 +1802,7 @@
                 <w:rFonts w:ascii="Calibri" w:hAnsi="Calibri"/>
                 <w:sz w:val="16"/>
               </w:rPr>
-              <w:t>frappe-automated-tester, QA Engineers</w:t>
+              <w:t>frappe-fullstack-developer</w:t>
             </w:r>
           </w:p>
         </w:tc>
@@ -1582,7 +1830,7 @@
                 <w:color w:val="1F4E79"/>
                 <w:sz w:val="16"/>
               </w:rPr>
-              <w:t>frappe-automated-tester</w:t>
+              <w:t>frappe-manual-qa</w:t>
             </w:r>
           </w:p>
         </w:tc>
@@ -1606,7 +1854,7 @@
                 <w:rFonts w:ascii="Calibri" w:hAnsi="Calibri"/>
                 <w:sz w:val="16"/>
               </w:rPr>
-              <w:t>Form DOM selectors &amp; QA scenarios</w:t>
+              <w:t>Prototype &amp; Controller rules</w:t>
             </w:r>
           </w:p>
         </w:tc>
@@ -1630,7 +1878,7 @@
                 <w:rFonts w:ascii="Calibri" w:hAnsi="Calibri"/>
                 <w:sz w:val="16"/>
               </w:rPr>
-              <w:t>Headless Playwright script generation; form entry &amp; state assertions</w:t>
+              <w:t>Boundary condition analysis, exploratory charters, QA matrices</w:t>
             </w:r>
           </w:p>
         </w:tc>
@@ -1654,7 +1902,7 @@
                 <w:rFonts w:ascii="Calibri" w:hAnsi="Calibri"/>
                 <w:sz w:val="16"/>
               </w:rPr>
-              <w:t>test_e2e_playwright.py</w:t>
+              <w:t>test_scenarios.md &amp; test_data.json</w:t>
             </w:r>
           </w:p>
         </w:tc>
@@ -1678,7 +1926,255 @@
                 <w:rFonts w:ascii="Calibri" w:hAnsi="Calibri"/>
                 <w:sz w:val="16"/>
               </w:rPr>
+              <w:t>frappe-automated-tester, QA Engineers</w:t>
+            </w:r>
+          </w:p>
+        </w:tc>
+      </w:tr>
+      <w:tr>
+        <w:tc>
+          <w:tcPr>
+            <w:tcW w:type="dxa" w:w="1930"/>
+            <w:shd w:fill="F8FAFC"/>
+            <w:tcMar>
+              <w:top w:w="35" w:type="dxa"/>
+              <w:bottom w:w="35" w:type="dxa"/>
+              <w:left w:w="50" w:type="dxa"/>
+              <w:right w:w="50" w:type="dxa"/>
+            </w:tcMar>
+          </w:tcPr>
+          <w:p>
+            <w:pPr>
+              <w:spacing w:after="0"/>
+            </w:pPr>
+            <w:r>
+              <w:rPr>
+                <w:rFonts w:ascii="Calibri" w:hAnsi="Calibri"/>
+                <w:b/>
+                <w:color w:val="1F4E79"/>
+                <w:sz w:val="16"/>
+              </w:rPr>
+              <w:t>frappe-automated-tester</w:t>
+            </w:r>
+          </w:p>
+        </w:tc>
+        <w:tc>
+          <w:tcPr>
+            <w:tcW w:type="dxa" w:w="1930"/>
+            <w:shd w:fill="F8FAFC"/>
+            <w:tcMar>
+              <w:top w:w="35" w:type="dxa"/>
+              <w:bottom w:w="35" w:type="dxa"/>
+              <w:left w:w="50" w:type="dxa"/>
+              <w:right w:w="50" w:type="dxa"/>
+            </w:tcMar>
+          </w:tcPr>
+          <w:p>
+            <w:pPr>
+              <w:spacing w:after="0"/>
+            </w:pPr>
+            <w:r>
+              <w:rPr>
+                <w:rFonts w:ascii="Calibri" w:hAnsi="Calibri"/>
+                <w:sz w:val="16"/>
+              </w:rPr>
+              <w:t>Form DOM selectors &amp; QA scenarios</w:t>
+            </w:r>
+          </w:p>
+        </w:tc>
+        <w:tc>
+          <w:tcPr>
+            <w:tcW w:type="dxa" w:w="1930"/>
+            <w:shd w:fill="F8FAFC"/>
+            <w:tcMar>
+              <w:top w:w="35" w:type="dxa"/>
+              <w:bottom w:w="35" w:type="dxa"/>
+              <w:left w:w="50" w:type="dxa"/>
+              <w:right w:w="50" w:type="dxa"/>
+            </w:tcMar>
+          </w:tcPr>
+          <w:p>
+            <w:pPr>
+              <w:spacing w:after="0"/>
+            </w:pPr>
+            <w:r>
+              <w:rPr>
+                <w:rFonts w:ascii="Calibri" w:hAnsi="Calibri"/>
+                <w:sz w:val="16"/>
+              </w:rPr>
+              <w:t>Headless Playwright script generation; form entry &amp; state assertions</w:t>
+            </w:r>
+          </w:p>
+        </w:tc>
+        <w:tc>
+          <w:tcPr>
+            <w:tcW w:type="dxa" w:w="1930"/>
+            <w:shd w:fill="F8FAFC"/>
+            <w:tcMar>
+              <w:top w:w="35" w:type="dxa"/>
+              <w:bottom w:w="35" w:type="dxa"/>
+              <w:left w:w="50" w:type="dxa"/>
+              <w:right w:w="50" w:type="dxa"/>
+            </w:tcMar>
+          </w:tcPr>
+          <w:p>
+            <w:pPr>
+              <w:spacing w:after="0"/>
+            </w:pPr>
+            <w:r>
+              <w:rPr>
+                <w:rFonts w:ascii="Calibri" w:hAnsi="Calibri"/>
+                <w:sz w:val="16"/>
+              </w:rPr>
+              <w:t>test_e2e_playwright.py</w:t>
+            </w:r>
+          </w:p>
+        </w:tc>
+        <w:tc>
+          <w:tcPr>
+            <w:tcW w:type="dxa" w:w="1930"/>
+            <w:shd w:fill="F8FAFC"/>
+            <w:tcMar>
+              <w:top w:w="35" w:type="dxa"/>
+              <w:bottom w:w="35" w:type="dxa"/>
+              <w:left w:w="50" w:type="dxa"/>
+              <w:right w:w="50" w:type="dxa"/>
+            </w:tcMar>
+          </w:tcPr>
+          <w:p>
+            <w:pPr>
+              <w:spacing w:after="0"/>
+            </w:pPr>
+            <w:r>
+              <w:rPr>
+                <w:rFonts w:ascii="Calibri" w:hAnsi="Calibri"/>
+                <w:sz w:val="16"/>
+              </w:rPr>
               <w:t>CI/CD Runner, Bench test runner</w:t>
+            </w:r>
+          </w:p>
+        </w:tc>
+      </w:tr>
+      <w:tr>
+        <w:tc>
+          <w:tcPr>
+            <w:tcW w:type="dxa" w:w="1930"/>
+            <w:shd w:fill="FFFFFF"/>
+            <w:tcMar>
+              <w:top w:w="35" w:type="dxa"/>
+              <w:bottom w:w="35" w:type="dxa"/>
+              <w:left w:w="50" w:type="dxa"/>
+              <w:right w:w="50" w:type="dxa"/>
+            </w:tcMar>
+          </w:tcPr>
+          <w:p>
+            <w:pPr>
+              <w:spacing w:after="0"/>
+            </w:pPr>
+            <w:r>
+              <w:rPr>
+                <w:rFonts w:ascii="Calibri" w:hAnsi="Calibri"/>
+                <w:b/>
+                <w:color w:val="1F4E79"/>
+                <w:sz w:val="16"/>
+              </w:rPr>
+              <w:t>frappe-self-healing-debugger</w:t>
+            </w:r>
+          </w:p>
+        </w:tc>
+        <w:tc>
+          <w:tcPr>
+            <w:tcW w:type="dxa" w:w="1930"/>
+            <w:shd w:fill="FFFFFF"/>
+            <w:tcMar>
+              <w:top w:w="35" w:type="dxa"/>
+              <w:bottom w:w="35" w:type="dxa"/>
+              <w:left w:w="50" w:type="dxa"/>
+              <w:right w:w="50" w:type="dxa"/>
+            </w:tcMar>
+          </w:tcPr>
+          <w:p>
+            <w:pPr>
+              <w:spacing w:after="0"/>
+            </w:pPr>
+            <w:r>
+              <w:rPr>
+                <w:rFonts w:ascii="Calibri" w:hAnsi="Calibri"/>
+                <w:sz w:val="16"/>
+              </w:rPr>
+              <w:t>Test stack traces &amp; AST errors</w:t>
+            </w:r>
+          </w:p>
+        </w:tc>
+        <w:tc>
+          <w:tcPr>
+            <w:tcW w:type="dxa" w:w="1930"/>
+            <w:shd w:fill="FFFFFF"/>
+            <w:tcMar>
+              <w:top w:w="35" w:type="dxa"/>
+              <w:bottom w:w="35" w:type="dxa"/>
+              <w:left w:w="50" w:type="dxa"/>
+              <w:right w:w="50" w:type="dxa"/>
+            </w:tcMar>
+          </w:tcPr>
+          <w:p>
+            <w:pPr>
+              <w:spacing w:after="0"/>
+            </w:pPr>
+            <w:r>
+              <w:rPr>
+                <w:rFonts w:ascii="Calibri" w:hAnsi="Calibri"/>
+                <w:sz w:val="16"/>
+              </w:rPr>
+              <w:t>Traceback isolation, root-cause analysis, surgical auto-patching</w:t>
+            </w:r>
+          </w:p>
+        </w:tc>
+        <w:tc>
+          <w:tcPr>
+            <w:tcW w:type="dxa" w:w="1930"/>
+            <w:shd w:fill="FFFFFF"/>
+            <w:tcMar>
+              <w:top w:w="35" w:type="dxa"/>
+              <w:bottom w:w="35" w:type="dxa"/>
+              <w:left w:w="50" w:type="dxa"/>
+              <w:right w:w="50" w:type="dxa"/>
+            </w:tcMar>
+          </w:tcPr>
+          <w:p>
+            <w:pPr>
+              <w:spacing w:after="0"/>
+            </w:pPr>
+            <w:r>
+              <w:rPr>
+                <w:rFonts w:ascii="Calibri" w:hAnsi="Calibri"/>
+                <w:sz w:val="16"/>
+              </w:rPr>
+              <w:t>Surgical code patches &amp; repairs</w:t>
+            </w:r>
+          </w:p>
+        </w:tc>
+        <w:tc>
+          <w:tcPr>
+            <w:tcW w:type="dxa" w:w="1930"/>
+            <w:shd w:fill="FFFFFF"/>
+            <w:tcMar>
+              <w:top w:w="35" w:type="dxa"/>
+              <w:bottom w:w="35" w:type="dxa"/>
+              <w:left w:w="50" w:type="dxa"/>
+              <w:right w:w="50" w:type="dxa"/>
+            </w:tcMar>
+          </w:tcPr>
+          <w:p>
+            <w:pPr>
+              <w:spacing w:after="0"/>
+            </w:pPr>
+            <w:r>
+              <w:rPr>
+                <w:rFonts w:ascii="Calibri" w:hAnsi="Calibri"/>
+                <w:sz w:val="16"/>
+              </w:rPr>
+              <w:t>frappe-automated-tester, orchestrator</w:t>
             </w:r>
           </w:p>
         </w:tc>
@@ -2051,6 +2547,254 @@
                 <w:sz w:val="16"/>
               </w:rPr>
               <w:t>frappe-code-reviewer</w:t>
+            </w:r>
+          </w:p>
+        </w:tc>
+      </w:tr>
+      <w:tr>
+        <w:tc>
+          <w:tcPr>
+            <w:tcW w:type="dxa" w:w="1930"/>
+            <w:shd w:fill="FFFFFF"/>
+            <w:tcMar>
+              <w:top w:w="35" w:type="dxa"/>
+              <w:bottom w:w="35" w:type="dxa"/>
+              <w:left w:w="50" w:type="dxa"/>
+              <w:right w:w="50" w:type="dxa"/>
+            </w:tcMar>
+          </w:tcPr>
+          <w:p>
+            <w:pPr>
+              <w:spacing w:after="0"/>
+            </w:pPr>
+            <w:r>
+              <w:rPr>
+                <w:rFonts w:ascii="Calibri" w:hAnsi="Calibri"/>
+                <w:b/>
+                <w:color w:val="1F4E79"/>
+                <w:sz w:val="16"/>
+              </w:rPr>
+              <w:t>frappe-integrations-broker</w:t>
+            </w:r>
+          </w:p>
+        </w:tc>
+        <w:tc>
+          <w:tcPr>
+            <w:tcW w:type="dxa" w:w="1930"/>
+            <w:shd w:fill="FFFFFF"/>
+            <w:tcMar>
+              <w:top w:w="35" w:type="dxa"/>
+              <w:bottom w:w="35" w:type="dxa"/>
+              <w:left w:w="50" w:type="dxa"/>
+              <w:right w:w="50" w:type="dxa"/>
+            </w:tcMar>
+          </w:tcPr>
+          <w:p>
+            <w:pPr>
+              <w:spacing w:after="0"/>
+            </w:pPr>
+            <w:r>
+              <w:rPr>
+                <w:rFonts w:ascii="Calibri" w:hAnsi="Calibri"/>
+                <w:sz w:val="16"/>
+              </w:rPr>
+              <w:t>Third-party API requirements</w:t>
+            </w:r>
+          </w:p>
+        </w:tc>
+        <w:tc>
+          <w:tcPr>
+            <w:tcW w:type="dxa" w:w="1930"/>
+            <w:shd w:fill="FFFFFF"/>
+            <w:tcMar>
+              <w:top w:w="35" w:type="dxa"/>
+              <w:bottom w:w="35" w:type="dxa"/>
+              <w:left w:w="50" w:type="dxa"/>
+              <w:right w:w="50" w:type="dxa"/>
+            </w:tcMar>
+          </w:tcPr>
+          <w:p>
+            <w:pPr>
+              <w:spacing w:after="0"/>
+            </w:pPr>
+            <w:r>
+              <w:rPr>
+                <w:rFonts w:ascii="Calibri" w:hAnsi="Calibri"/>
+                <w:sz w:val="16"/>
+              </w:rPr>
+              <w:t>Stripe/PayPal payment webhooks, WhatsApp Cloud API, S3/GCS sync</w:t>
+            </w:r>
+          </w:p>
+        </w:tc>
+        <w:tc>
+          <w:tcPr>
+            <w:tcW w:type="dxa" w:w="1930"/>
+            <w:shd w:fill="FFFFFF"/>
+            <w:tcMar>
+              <w:top w:w="35" w:type="dxa"/>
+              <w:bottom w:w="35" w:type="dxa"/>
+              <w:left w:w="50" w:type="dxa"/>
+              <w:right w:w="50" w:type="dxa"/>
+            </w:tcMar>
+          </w:tcPr>
+          <w:p>
+            <w:pPr>
+              <w:spacing w:after="0"/>
+            </w:pPr>
+            <w:r>
+              <w:rPr>
+                <w:rFonts w:ascii="Calibri" w:hAnsi="Calibri"/>
+                <w:sz w:val="16"/>
+              </w:rPr>
+              <w:t>Integration adapters &amp; workers</w:t>
+            </w:r>
+          </w:p>
+        </w:tc>
+        <w:tc>
+          <w:tcPr>
+            <w:tcW w:type="dxa" w:w="1930"/>
+            <w:shd w:fill="FFFFFF"/>
+            <w:tcMar>
+              <w:top w:w="35" w:type="dxa"/>
+              <w:bottom w:w="35" w:type="dxa"/>
+              <w:left w:w="50" w:type="dxa"/>
+              <w:right w:w="50" w:type="dxa"/>
+            </w:tcMar>
+          </w:tcPr>
+          <w:p>
+            <w:pPr>
+              <w:spacing w:after="0"/>
+            </w:pPr>
+            <w:r>
+              <w:rPr>
+                <w:rFonts w:ascii="Calibri" w:hAnsi="Calibri"/>
+                <w:sz w:val="16"/>
+              </w:rPr>
+              <w:t>frappe-fullstack-developer</w:t>
+            </w:r>
+          </w:p>
+        </w:tc>
+      </w:tr>
+      <w:tr>
+        <w:tc>
+          <w:tcPr>
+            <w:tcW w:type="dxa" w:w="1930"/>
+            <w:shd w:fill="F8FAFC"/>
+            <w:tcMar>
+              <w:top w:w="35" w:type="dxa"/>
+              <w:bottom w:w="35" w:type="dxa"/>
+              <w:left w:w="50" w:type="dxa"/>
+              <w:right w:w="50" w:type="dxa"/>
+            </w:tcMar>
+          </w:tcPr>
+          <w:p>
+            <w:pPr>
+              <w:spacing w:after="0"/>
+            </w:pPr>
+            <w:r>
+              <w:rPr>
+                <w:rFonts w:ascii="Calibri" w:hAnsi="Calibri"/>
+                <w:b/>
+                <w:color w:val="1F4E79"/>
+                <w:sz w:val="16"/>
+              </w:rPr>
+              <w:t>frappe-print-format-designer</w:t>
+            </w:r>
+          </w:p>
+        </w:tc>
+        <w:tc>
+          <w:tcPr>
+            <w:tcW w:type="dxa" w:w="1930"/>
+            <w:shd w:fill="F8FAFC"/>
+            <w:tcMar>
+              <w:top w:w="35" w:type="dxa"/>
+              <w:bottom w:w="35" w:type="dxa"/>
+              <w:left w:w="50" w:type="dxa"/>
+              <w:right w:w="50" w:type="dxa"/>
+            </w:tcMar>
+          </w:tcPr>
+          <w:p>
+            <w:pPr>
+              <w:spacing w:after="0"/>
+            </w:pPr>
+            <w:r>
+              <w:rPr>
+                <w:rFonts w:ascii="Calibri" w:hAnsi="Calibri"/>
+                <w:sz w:val="16"/>
+              </w:rPr>
+              <w:t>DocType fields &amp; branding specs</w:t>
+            </w:r>
+          </w:p>
+        </w:tc>
+        <w:tc>
+          <w:tcPr>
+            <w:tcW w:type="dxa" w:w="1930"/>
+            <w:shd w:fill="F8FAFC"/>
+            <w:tcMar>
+              <w:top w:w="35" w:type="dxa"/>
+              <w:bottom w:w="35" w:type="dxa"/>
+              <w:left w:w="50" w:type="dxa"/>
+              <w:right w:w="50" w:type="dxa"/>
+            </w:tcMar>
+          </w:tcPr>
+          <w:p>
+            <w:pPr>
+              <w:spacing w:after="0"/>
+            </w:pPr>
+            <w:r>
+              <w:rPr>
+                <w:rFonts w:ascii="Calibri" w:hAnsi="Calibri"/>
+                <w:sz w:val="16"/>
+              </w:rPr>
+              <w:t>Jinja2 HTML/CSS templates, barcode labels, tax invoices</w:t>
+            </w:r>
+          </w:p>
+        </w:tc>
+        <w:tc>
+          <w:tcPr>
+            <w:tcW w:type="dxa" w:w="1930"/>
+            <w:shd w:fill="F8FAFC"/>
+            <w:tcMar>
+              <w:top w:w="35" w:type="dxa"/>
+              <w:bottom w:w="35" w:type="dxa"/>
+              <w:left w:w="50" w:type="dxa"/>
+              <w:right w:w="50" w:type="dxa"/>
+            </w:tcMar>
+          </w:tcPr>
+          <w:p>
+            <w:pPr>
+              <w:spacing w:after="0"/>
+            </w:pPr>
+            <w:r>
+              <w:rPr>
+                <w:rFonts w:ascii="Calibri" w:hAnsi="Calibri"/>
+                <w:sz w:val="16"/>
+              </w:rPr>
+              <w:t>Print Format HTML/CSS records</w:t>
+            </w:r>
+          </w:p>
+        </w:tc>
+        <w:tc>
+          <w:tcPr>
+            <w:tcW w:type="dxa" w:w="1930"/>
+            <w:shd w:fill="F8FAFC"/>
+            <w:tcMar>
+              <w:top w:w="35" w:type="dxa"/>
+              <w:bottom w:w="35" w:type="dxa"/>
+              <w:left w:w="50" w:type="dxa"/>
+              <w:right w:w="50" w:type="dxa"/>
+            </w:tcMar>
+          </w:tcPr>
+          <w:p>
+            <w:pPr>
+              <w:spacing w:after="0"/>
+            </w:pPr>
+            <w:r>
+              <w:rPr>
+                <w:rFonts w:ascii="Calibri" w:hAnsi="Calibri"/>
+                <w:sz w:val="16"/>
+              </w:rPr>
+              <w:t>frappe-desk-builder</w:t>
             </w:r>
           </w:p>
         </w:tc>
@@ -2698,7 +3442,7 @@
                 <w:color w:val="1F4E79"/>
                 <w:sz w:val="16"/>
               </w:rPr>
-              <w:t>frappe-doc-updater</w:t>
+              <w:t>frappe-release-devops</w:t>
             </w:r>
           </w:p>
         </w:tc>
@@ -2722,7 +3466,7 @@
                 <w:rFonts w:ascii="Calibri" w:hAnsi="Calibri"/>
                 <w:sz w:val="16"/>
               </w:rPr>
-              <w:t>Schemas, APIs, and controllers</w:t>
+              <w:t>App codebase &amp; test scripts</w:t>
             </w:r>
           </w:p>
         </w:tc>
@@ -2746,7 +3490,7 @@
                 <w:rFonts w:ascii="Calibri" w:hAnsi="Calibri"/>
                 <w:sz w:val="16"/>
               </w:rPr>
-              <w:t>API documentation synchronization and end-user manuals</w:t>
+              <w:t>GitHub Actions CI/CD workflows, multi-stage Dockerfile, compose.yaml</w:t>
             </w:r>
           </w:p>
         </w:tc>
@@ -2770,7 +3514,7 @@
                 <w:rFonts w:ascii="Calibri" w:hAnsi="Calibri"/>
                 <w:sz w:val="16"/>
               </w:rPr>
-              <w:t>README.md, developer docs</w:t>
+              <w:t>ci.yml, Dockerfile, compose.yaml</w:t>
             </w:r>
           </w:p>
         </w:tc>
@@ -2794,7 +3538,7 @@
                 <w:rFonts w:ascii="Calibri" w:hAnsi="Calibri"/>
                 <w:sz w:val="16"/>
               </w:rPr>
-              <w:t>Technical Writers &amp; End Users</w:t>
+              <w:t>DevOps &amp; Cloud Engineers</w:t>
             </w:r>
           </w:p>
         </w:tc>
@@ -2822,7 +3566,7 @@
                 <w:color w:val="1F4E79"/>
                 <w:sz w:val="16"/>
               </w:rPr>
-              <w:t>frappe-code-reviewer</w:t>
+              <w:t>frappe-doc-updater</w:t>
             </w:r>
           </w:p>
         </w:tc>
@@ -2846,7 +3590,7 @@
                 <w:rFonts w:ascii="Calibri" w:hAnsi="Calibri"/>
                 <w:sz w:val="16"/>
               </w:rPr>
-              <w:t>Git diff of implemented code</w:t>
+              <w:t>Schemas, APIs, and controllers</w:t>
             </w:r>
           </w:p>
         </w:tc>
@@ -2870,7 +3614,7 @@
                 <w:rFonts w:ascii="Calibri" w:hAnsi="Calibri"/>
                 <w:sz w:val="16"/>
               </w:rPr>
-              <w:t>Fresh-context review for Frappe anti-patterns and N+1 query loops</w:t>
+              <w:t>API documentation synchronization and end-user manuals</w:t>
             </w:r>
           </w:p>
         </w:tc>
@@ -2894,7 +3638,7 @@
                 <w:rFonts w:ascii="Calibri" w:hAnsi="Calibri"/>
                 <w:sz w:val="16"/>
               </w:rPr>
-              <w:t>Structured code review report</w:t>
+              <w:t>README.md, developer docs</w:t>
             </w:r>
           </w:p>
         </w:tc>
@@ -2918,7 +3662,7 @@
                 <w:rFonts w:ascii="Calibri" w:hAnsi="Calibri"/>
                 <w:sz w:val="16"/>
               </w:rPr>
-              <w:t>Software Engineers</w:t>
+              <w:t>Technical Writers &amp; End Users</w:t>
             </w:r>
           </w:p>
         </w:tc>
@@ -2946,7 +3690,7 @@
                 <w:color w:val="1F4E79"/>
                 <w:sz w:val="16"/>
               </w:rPr>
-              <w:t>frappe-security-reviewer</w:t>
+              <w:t>frappe-code-reviewer</w:t>
             </w:r>
           </w:p>
         </w:tc>
@@ -2970,7 +3714,7 @@
                 <w:rFonts w:ascii="Calibri" w:hAnsi="Calibri"/>
                 <w:sz w:val="16"/>
               </w:rPr>
-              <w:t>Full application codebase</w:t>
+              <w:t>Git diff of implemented code</w:t>
             </w:r>
           </w:p>
         </w:tc>
@@ -2994,7 +3738,7 @@
                 <w:rFonts w:ascii="Calibri" w:hAnsi="Calibri"/>
                 <w:sz w:val="16"/>
               </w:rPr>
-              <w:t>AST static analysis (SQLi, CSRF, IDOR, transaction leaks)</w:t>
+              <w:t>Fresh-context review for Frappe anti-patterns and N+1 query loops</w:t>
             </w:r>
           </w:p>
         </w:tc>
@@ -3018,7 +3762,7 @@
                 <w:rFonts w:ascii="Calibri" w:hAnsi="Calibri"/>
                 <w:sz w:val="16"/>
               </w:rPr>
-              <w:t>Security audit report (frappe-shield)</w:t>
+              <w:t>Structured code review report</w:t>
             </w:r>
           </w:p>
         </w:tc>
@@ -3042,7 +3786,255 @@
                 <w:rFonts w:ascii="Calibri" w:hAnsi="Calibri"/>
                 <w:sz w:val="16"/>
               </w:rPr>
+              <w:t>Software Engineers</w:t>
+            </w:r>
+          </w:p>
+        </w:tc>
+      </w:tr>
+      <w:tr>
+        <w:tc>
+          <w:tcPr>
+            <w:tcW w:type="dxa" w:w="1930"/>
+            <w:shd w:fill="FFFFFF"/>
+            <w:tcMar>
+              <w:top w:w="35" w:type="dxa"/>
+              <w:bottom w:w="35" w:type="dxa"/>
+              <w:left w:w="50" w:type="dxa"/>
+              <w:right w:w="50" w:type="dxa"/>
+            </w:tcMar>
+          </w:tcPr>
+          <w:p>
+            <w:pPr>
+              <w:spacing w:after="0"/>
+            </w:pPr>
+            <w:r>
+              <w:rPr>
+                <w:rFonts w:ascii="Calibri" w:hAnsi="Calibri"/>
+                <w:b/>
+                <w:color w:val="1F4E79"/>
+                <w:sz w:val="16"/>
+              </w:rPr>
+              <w:t>frappe-security-reviewer</w:t>
+            </w:r>
+          </w:p>
+        </w:tc>
+        <w:tc>
+          <w:tcPr>
+            <w:tcW w:type="dxa" w:w="1930"/>
+            <w:shd w:fill="FFFFFF"/>
+            <w:tcMar>
+              <w:top w:w="35" w:type="dxa"/>
+              <w:bottom w:w="35" w:type="dxa"/>
+              <w:left w:w="50" w:type="dxa"/>
+              <w:right w:w="50" w:type="dxa"/>
+            </w:tcMar>
+          </w:tcPr>
+          <w:p>
+            <w:pPr>
+              <w:spacing w:after="0"/>
+            </w:pPr>
+            <w:r>
+              <w:rPr>
+                <w:rFonts w:ascii="Calibri" w:hAnsi="Calibri"/>
+                <w:sz w:val="16"/>
+              </w:rPr>
+              <w:t>Full application codebase</w:t>
+            </w:r>
+          </w:p>
+        </w:tc>
+        <w:tc>
+          <w:tcPr>
+            <w:tcW w:type="dxa" w:w="1930"/>
+            <w:shd w:fill="FFFFFF"/>
+            <w:tcMar>
+              <w:top w:w="35" w:type="dxa"/>
+              <w:bottom w:w="35" w:type="dxa"/>
+              <w:left w:w="50" w:type="dxa"/>
+              <w:right w:w="50" w:type="dxa"/>
+            </w:tcMar>
+          </w:tcPr>
+          <w:p>
+            <w:pPr>
+              <w:spacing w:after="0"/>
+            </w:pPr>
+            <w:r>
+              <w:rPr>
+                <w:rFonts w:ascii="Calibri" w:hAnsi="Calibri"/>
+                <w:sz w:val="16"/>
+              </w:rPr>
+              <w:t>AST static analysis (SQLi, CSRF, IDOR, transaction leaks)</w:t>
+            </w:r>
+          </w:p>
+        </w:tc>
+        <w:tc>
+          <w:tcPr>
+            <w:tcW w:type="dxa" w:w="1930"/>
+            <w:shd w:fill="FFFFFF"/>
+            <w:tcMar>
+              <w:top w:w="35" w:type="dxa"/>
+              <w:bottom w:w="35" w:type="dxa"/>
+              <w:left w:w="50" w:type="dxa"/>
+              <w:right w:w="50" w:type="dxa"/>
+            </w:tcMar>
+          </w:tcPr>
+          <w:p>
+            <w:pPr>
+              <w:spacing w:after="0"/>
+            </w:pPr>
+            <w:r>
+              <w:rPr>
+                <w:rFonts w:ascii="Calibri" w:hAnsi="Calibri"/>
+                <w:sz w:val="16"/>
+              </w:rPr>
+              <w:t>Security audit report (frappe-shield)</w:t>
+            </w:r>
+          </w:p>
+        </w:tc>
+        <w:tc>
+          <w:tcPr>
+            <w:tcW w:type="dxa" w:w="1930"/>
+            <w:shd w:fill="FFFFFF"/>
+            <w:tcMar>
+              <w:top w:w="35" w:type="dxa"/>
+              <w:bottom w:w="35" w:type="dxa"/>
+              <w:left w:w="50" w:type="dxa"/>
+              <w:right w:w="50" w:type="dxa"/>
+            </w:tcMar>
+          </w:tcPr>
+          <w:p>
+            <w:pPr>
+              <w:spacing w:after="0"/>
+            </w:pPr>
+            <w:r>
+              <w:rPr>
+                <w:rFonts w:ascii="Calibri" w:hAnsi="Calibri"/>
+                <w:sz w:val="16"/>
+              </w:rPr>
               <w:t>Release Managers &amp; CI/CD</w:t>
+            </w:r>
+          </w:p>
+        </w:tc>
+      </w:tr>
+      <w:tr>
+        <w:tc>
+          <w:tcPr>
+            <w:tcW w:type="dxa" w:w="1930"/>
+            <w:shd w:fill="F8FAFC"/>
+            <w:tcMar>
+              <w:top w:w="35" w:type="dxa"/>
+              <w:bottom w:w="35" w:type="dxa"/>
+              <w:left w:w="50" w:type="dxa"/>
+              <w:right w:w="50" w:type="dxa"/>
+            </w:tcMar>
+          </w:tcPr>
+          <w:p>
+            <w:pPr>
+              <w:spacing w:after="0"/>
+            </w:pPr>
+            <w:r>
+              <w:rPr>
+                <w:rFonts w:ascii="Calibri" w:hAnsi="Calibri"/>
+                <w:b/>
+                <w:color w:val="1F4E79"/>
+                <w:sz w:val="16"/>
+              </w:rPr>
+              <w:t>frappe-planner</w:t>
+            </w:r>
+          </w:p>
+        </w:tc>
+        <w:tc>
+          <w:tcPr>
+            <w:tcW w:type="dxa" w:w="1930"/>
+            <w:shd w:fill="F8FAFC"/>
+            <w:tcMar>
+              <w:top w:w="35" w:type="dxa"/>
+              <w:bottom w:w="35" w:type="dxa"/>
+              <w:left w:w="50" w:type="dxa"/>
+              <w:right w:w="50" w:type="dxa"/>
+            </w:tcMar>
+          </w:tcPr>
+          <w:p>
+            <w:pPr>
+              <w:spacing w:after="0"/>
+            </w:pPr>
+            <w:r>
+              <w:rPr>
+                <w:rFonts w:ascii="Calibri" w:hAnsi="Calibri"/>
+                <w:sz w:val="16"/>
+              </w:rPr>
+              <w:t>HLD.md + LLD.md</w:t>
+            </w:r>
+          </w:p>
+        </w:tc>
+        <w:tc>
+          <w:tcPr>
+            <w:tcW w:type="dxa" w:w="1930"/>
+            <w:shd w:fill="F8FAFC"/>
+            <w:tcMar>
+              <w:top w:w="35" w:type="dxa"/>
+              <w:bottom w:w="35" w:type="dxa"/>
+              <w:left w:w="50" w:type="dxa"/>
+              <w:right w:w="50" w:type="dxa"/>
+            </w:tcMar>
+          </w:tcPr>
+          <w:p>
+            <w:pPr>
+              <w:spacing w:after="0"/>
+            </w:pPr>
+            <w:r>
+              <w:rPr>
+                <w:rFonts w:ascii="Calibri" w:hAnsi="Calibri"/>
+                <w:sz w:val="16"/>
+              </w:rPr>
+              <w:t>Taxonomy mapping, autonaming rules, DocType scaffolding</w:t>
+            </w:r>
+          </w:p>
+        </w:tc>
+        <w:tc>
+          <w:tcPr>
+            <w:tcW w:type="dxa" w:w="1930"/>
+            <w:shd w:fill="F8FAFC"/>
+            <w:tcMar>
+              <w:top w:w="35" w:type="dxa"/>
+              <w:bottom w:w="35" w:type="dxa"/>
+              <w:left w:w="50" w:type="dxa"/>
+              <w:right w:w="50" w:type="dxa"/>
+            </w:tcMar>
+          </w:tcPr>
+          <w:p>
+            <w:pPr>
+              <w:spacing w:after="0"/>
+            </w:pPr>
+            <w:r>
+              <w:rPr>
+                <w:rFonts w:ascii="Calibri" w:hAnsi="Calibri"/>
+                <w:sz w:val="16"/>
+              </w:rPr>
+              <w:t>DocType JSON blueprints</w:t>
+            </w:r>
+          </w:p>
+        </w:tc>
+        <w:tc>
+          <w:tcPr>
+            <w:tcW w:type="dxa" w:w="1930"/>
+            <w:shd w:fill="F8FAFC"/>
+            <w:tcMar>
+              <w:top w:w="35" w:type="dxa"/>
+              <w:bottom w:w="35" w:type="dxa"/>
+              <w:left w:w="50" w:type="dxa"/>
+              <w:right w:w="50" w:type="dxa"/>
+            </w:tcMar>
+          </w:tcPr>
+          <w:p>
+            <w:pPr>
+              <w:spacing w:after="0"/>
+            </w:pPr>
+            <w:r>
+              <w:rPr>
+                <w:rFonts w:ascii="Calibri" w:hAnsi="Calibri"/>
+                <w:sz w:val="16"/>
+              </w:rPr>
+              <w:t>frappe-fullstack-developer, frappe-tdd-guide</w:t>
             </w:r>
           </w:p>
         </w:tc>

</xml_diff>